<commit_message>
docs: regenerate the Word version of every updated document
</commit_message>
<xml_diff>
--- a/03_PROPUESTA_TECNICA_DEL_SOFTWARE/EN/WORD/03_Software_Technical_Proposal.docx
+++ b/03_PROPUESTA_TECNICA_DEL_SOFTWARE/EN/WORD/03_Software_Technical_Proposal.docx
@@ -48,7 +48,7 @@
         <w:pStyle w:val="BodyText"/>
       </w:pPr>
       <w:r>
-        <w:t xml:space="preserve">Version 1.1, October 15, 2026</w:t>
+        <w:t xml:space="preserve">Version 1.2, October 17, 2026</w:t>
       </w:r>
     </w:p>
     <w:p>
@@ -527,7 +527,7 @@
               <w:pStyle w:val="Compact"/>
             </w:pPr>
             <w:r>
-              <w:t xml:space="preserve">React Native 0.86 + Expo SDK 57</w:t>
+              <w:t xml:space="preserve">React Native 0.86 + Expo SDK 57 (with expo-image-picker and expo-image-manipulator for the inspection photos)</w:t>
             </w:r>
           </w:p>
         </w:tc>
@@ -1892,6 +1892,68 @@
         </w:tc>
       </w:tr>
     </w:tbl>
+    <w:p>
+      <w:pPr>
+        <w:pStyle w:val="BodyText"/>
+      </w:pPr>
+      <w:r>
+        <w:rPr>
+          <w:i/>
+          <w:iCs/>
+        </w:rPr>
+        <w:t xml:space="preserve">Note.</w:t>
+      </w:r>
+      <w:r>
+        <w:t xml:space="preserve"> </w:t>
+      </w:r>
+      <w:r>
+        <w:t xml:space="preserve">Environments planned in the proposal; the costs of section 8.2 were calculated with these specifications.</w:t>
+      </w:r>
+    </w:p>
+    <w:p>
+      <w:pPr>
+        <w:pStyle w:val="BodyText"/>
+      </w:pPr>
+      <w:r>
+        <w:rPr>
+          <w:b/>
+          <w:bCs/>
+        </w:rPr>
+        <w:t xml:space="preserve">Follow-up as of October 17, 2026.</w:t>
+      </w:r>
+      <w:r>
+        <w:t xml:space="preserve"> </w:t>
+      </w:r>
+      <w:r>
+        <w:t xml:space="preserve">For the academic demonstration, the system was deployed on a Microsoft Azure virtual machine (</w:t>
+      </w:r>
+      <w:r>
+        <w:rPr>
+          <w:i/>
+          <w:iCs/>
+        </w:rPr>
+        <w:t xml:space="preserve">Azure for Students</w:t>
+      </w:r>
+      <w:r>
+        <w:t xml:space="preserve"> </w:t>
+      </w:r>
+      <w:r>
+        <w:t xml:space="preserve">subscription, B2as_v2 size: 2 vCPU, 7.7 GB of RAM, and a 64 GB SSD, Ubuntu 24.04 LTS), with the eleven containers, Caddy as the HTTPS entry point, and the Android app served under</w:t>
+      </w:r>
+      <w:r>
+        <w:t xml:space="preserve"> </w:t>
+      </w:r>
+      <w:r>
+        <w:rPr>
+          <w:i/>
+          <w:iCs/>
+        </w:rPr>
+        <w:t xml:space="preserve">/app</w:t>
+      </w:r>
+      <w:r>
+        <w:t xml:space="preserve">. With every container running it uses about 3.3 GB of RAM, so the production size of Table 5 is still comfortable. The full procedure is in the Deployment Document (folder 07).</w:t>
+      </w:r>
+    </w:p>
     <w:bookmarkEnd w:id="29"/>
     <w:bookmarkStart w:id="30" w:name="X40fc8b0ae8aa6259c2932519e0af4277a4161f3"/>
     <w:p>

</xml_diff>

<commit_message>
docs(proposal): redraw the container figure and update the follow-up notes (1.3)
</commit_message>
<xml_diff>
--- a/03_PROPUESTA_TECNICA_DEL_SOFTWARE/EN/WORD/03_Software_Technical_Proposal.docx
+++ b/03_PROPUESTA_TECNICA_DEL_SOFTWARE/EN/WORD/03_Software_Technical_Proposal.docx
@@ -48,7 +48,7 @@
         <w:pStyle w:val="BodyText"/>
       </w:pPr>
       <w:r>
-        <w:t xml:space="preserve">Version 1.2, October 17, 2026</w:t>
+        <w:t xml:space="preserve">Version 1.3, October 20, 2026</w:t>
       </w:r>
     </w:p>
     <w:p>
@@ -193,14 +193,14 @@
       <w:r>
         <w:drawing>
           <wp:inline>
-            <wp:extent cx="5334000" cy="3469250"/>
+            <wp:extent cx="5334000" cy="7936871"/>
             <wp:effectExtent b="0" l="0" r="0" t="0"/>
             <wp:docPr descr="" title="" id="22" name="Picture"/>
             <a:graphic>
               <a:graphicData uri="http://schemas.openxmlformats.org/drawingml/2006/picture">
                 <pic:pic>
                   <pic:nvPicPr>
-                    <pic:cNvPr descr="03_Software_Technical_Proposal_diagramas/diagrama_01.png" id="23" name="Picture"/>
+                    <pic:cNvPr descr="diagrama-1.png" id="23" name="Picture"/>
                     <pic:cNvPicPr>
                       <a:picLocks noChangeArrowheads="1" noChangeAspect="1"/>
                     </pic:cNvPicPr>
@@ -214,7 +214,7 @@
                   <pic:spPr bwMode="auto">
                     <a:xfrm>
                       <a:off x="0" y="0"/>
-                      <a:ext cx="5334000" cy="3469250"/>
+                      <a:ext cx="5334000" cy="7936871"/>
                     </a:xfrm>
                     <a:prstGeom prst="rect">
                       <a:avLst/>
@@ -238,6 +238,27 @@
         <w:pStyle w:val="BodyText"/>
       </w:pPr>
       <w:r>
+        <w:t xml:space="preserve">The REST calls between services and the RabbitMQ events are detailed in section 3.3 of the</w:t>
+      </w:r>
+      <w:r>
+        <w:t xml:space="preserve"> </w:t>
+      </w:r>
+      <w:r>
+        <w:rPr>
+          <w:i/>
+          <w:iCs/>
+        </w:rPr>
+        <w:t xml:space="preserve">Software Design Documentation</w:t>
+      </w:r>
+      <w:r>
+        <w:t xml:space="preserve">.</w:t>
+      </w:r>
+    </w:p>
+    <w:p>
+      <w:pPr>
+        <w:pStyle w:val="BodyText"/>
+      </w:pPr>
+      <w:r>
         <w:t xml:space="preserve">Inside each service we follow</w:t>
       </w:r>
       <w:r>
@@ -1951,7 +1972,22 @@
         <w:t xml:space="preserve">/app</w:t>
       </w:r>
       <w:r>
-        <w:t xml:space="preserve">. With every container running it uses about 3.3 GB of RAM, so the production size of Table 5 is still comfortable. The full procedure is in the Deployment Document (folder 07).</w:t>
+        <w:t xml:space="preserve">. With every container running it uses about 3.3 GB of RAM, so the production size of Table 5 is still comfortable. The full procedure is in the Deployment Document (folder 07). In the academic project, continuous integration was not done with Jenkins but with GitHub Actions: the 10 code repositories build and run their tests on every change, and</w:t>
+      </w:r>
+      <w:r>
+        <w:t xml:space="preserve"> </w:t>
+      </w:r>
+      <w:r>
+        <w:rPr>
+          <w:rStyle w:val="VerbatimChar"/>
+        </w:rPr>
+        <w:t xml:space="preserve">lavarapido-infra</w:t>
+      </w:r>
+      <w:r>
+        <w:t xml:space="preserve"> </w:t>
+      </w:r>
+      <w:r>
+        <w:t xml:space="preserve">also has a manual workflow that updates the server.</w:t>
       </w:r>
     </w:p>
     <w:bookmarkEnd w:id="29"/>
@@ -17540,7 +17576,7 @@
       <w:color w:themeColor="accent1" w:themeShade="BF" w:val="365F91"/>
     </w:rPr>
   </w:style>
-  <w:style w:type="paragraph" w:customStyle="1" w:styleId="SourceCode">
+  <w:style w:customStyle="1" w:styleId="SourceCode" w:type="paragraph">
     <w:name w:val="Source Code"/>
     <w:basedOn w:val="Normal"/>
     <w:link w:val="VerbatimChar"/>
@@ -17548,7 +17584,7 @@
       <w:wordWrap w:val="off"/>
     </w:pPr>
   </w:style>
-  <w:style w:type="character" w:customStyle="1" w:styleId="KeywordTok">
+  <w:style w:customStyle="1" w:styleId="KeywordTok" w:type="character">
     <w:name w:val="KeywordTok"/>
     <w:basedOn w:val="VerbatimChar"/>
     <w:rPr>
@@ -17556,77 +17592,77 @@
       <w:color w:val="007020"/>
     </w:rPr>
   </w:style>
-  <w:style w:type="character" w:customStyle="1" w:styleId="DataTypeTok">
+  <w:style w:customStyle="1" w:styleId="DataTypeTok" w:type="character">
     <w:name w:val="DataTypeTok"/>
     <w:basedOn w:val="VerbatimChar"/>
     <w:rPr>
       <w:color w:val="902000"/>
     </w:rPr>
   </w:style>
-  <w:style w:type="character" w:customStyle="1" w:styleId="DecValTok">
+  <w:style w:customStyle="1" w:styleId="DecValTok" w:type="character">
     <w:name w:val="DecValTok"/>
     <w:basedOn w:val="VerbatimChar"/>
     <w:rPr>
       <w:color w:val="40a070"/>
     </w:rPr>
   </w:style>
-  <w:style w:type="character" w:customStyle="1" w:styleId="BaseNTok">
+  <w:style w:customStyle="1" w:styleId="BaseNTok" w:type="character">
     <w:name w:val="BaseNTok"/>
     <w:basedOn w:val="VerbatimChar"/>
     <w:rPr>
       <w:color w:val="40a070"/>
     </w:rPr>
   </w:style>
-  <w:style w:type="character" w:customStyle="1" w:styleId="FloatTok">
+  <w:style w:customStyle="1" w:styleId="FloatTok" w:type="character">
     <w:name w:val="FloatTok"/>
     <w:basedOn w:val="VerbatimChar"/>
     <w:rPr>
       <w:color w:val="40a070"/>
     </w:rPr>
   </w:style>
-  <w:style w:type="character" w:customStyle="1" w:styleId="ConstantTok">
+  <w:style w:customStyle="1" w:styleId="ConstantTok" w:type="character">
     <w:name w:val="ConstantTok"/>
     <w:basedOn w:val="VerbatimChar"/>
     <w:rPr>
       <w:color w:val="880000"/>
     </w:rPr>
   </w:style>
-  <w:style w:type="character" w:customStyle="1" w:styleId="CharTok">
+  <w:style w:customStyle="1" w:styleId="CharTok" w:type="character">
     <w:name w:val="CharTok"/>
     <w:basedOn w:val="VerbatimChar"/>
     <w:rPr>
       <w:color w:val="4070a0"/>
     </w:rPr>
   </w:style>
-  <w:style w:type="character" w:customStyle="1" w:styleId="SpecialCharTok">
+  <w:style w:customStyle="1" w:styleId="SpecialCharTok" w:type="character">
     <w:name w:val="SpecialCharTok"/>
     <w:basedOn w:val="VerbatimChar"/>
     <w:rPr>
       <w:color w:val="4070a0"/>
     </w:rPr>
   </w:style>
-  <w:style w:type="character" w:customStyle="1" w:styleId="StringTok">
+  <w:style w:customStyle="1" w:styleId="StringTok" w:type="character">
     <w:name w:val="StringTok"/>
     <w:basedOn w:val="VerbatimChar"/>
     <w:rPr>
       <w:color w:val="4070a0"/>
     </w:rPr>
   </w:style>
-  <w:style w:type="character" w:customStyle="1" w:styleId="VerbatimStringTok">
+  <w:style w:customStyle="1" w:styleId="VerbatimStringTok" w:type="character">
     <w:name w:val="VerbatimStringTok"/>
     <w:basedOn w:val="VerbatimChar"/>
     <w:rPr>
       <w:color w:val="4070a0"/>
     </w:rPr>
   </w:style>
-  <w:style w:type="character" w:customStyle="1" w:styleId="SpecialStringTok">
+  <w:style w:customStyle="1" w:styleId="SpecialStringTok" w:type="character">
     <w:name w:val="SpecialStringTok"/>
     <w:basedOn w:val="VerbatimChar"/>
     <w:rPr>
       <w:color w:val="bb6688"/>
     </w:rPr>
   </w:style>
-  <w:style w:type="character" w:customStyle="1" w:styleId="ImportTok">
+  <w:style w:customStyle="1" w:styleId="ImportTok" w:type="character">
     <w:name w:val="ImportTok"/>
     <w:basedOn w:val="VerbatimChar"/>
     <w:rPr>
@@ -17634,7 +17670,7 @@
       <w:color w:val="008000"/>
     </w:rPr>
   </w:style>
-  <w:style w:type="character" w:customStyle="1" w:styleId="CommentTok">
+  <w:style w:customStyle="1" w:styleId="CommentTok" w:type="character">
     <w:name w:val="CommentTok"/>
     <w:basedOn w:val="VerbatimChar"/>
     <w:rPr>
@@ -17642,7 +17678,7 @@
       <w:color w:val="60a0b0"/>
     </w:rPr>
   </w:style>
-  <w:style w:type="character" w:customStyle="1" w:styleId="DocumentationTok">
+  <w:style w:customStyle="1" w:styleId="DocumentationTok" w:type="character">
     <w:name w:val="DocumentationTok"/>
     <w:basedOn w:val="VerbatimChar"/>
     <w:rPr>
@@ -17650,7 +17686,7 @@
       <w:color w:val="ba2121"/>
     </w:rPr>
   </w:style>
-  <w:style w:type="character" w:customStyle="1" w:styleId="AnnotationTok">
+  <w:style w:customStyle="1" w:styleId="AnnotationTok" w:type="character">
     <w:name w:val="AnnotationTok"/>
     <w:basedOn w:val="VerbatimChar"/>
     <w:rPr>
@@ -17659,7 +17695,7 @@
       <w:color w:val="60a0b0"/>
     </w:rPr>
   </w:style>
-  <w:style w:type="character" w:customStyle="1" w:styleId="CommentVarTok">
+  <w:style w:customStyle="1" w:styleId="CommentVarTok" w:type="character">
     <w:name w:val="CommentVarTok"/>
     <w:basedOn w:val="VerbatimChar"/>
     <w:rPr>
@@ -17668,28 +17704,28 @@
       <w:color w:val="60a0b0"/>
     </w:rPr>
   </w:style>
-  <w:style w:type="character" w:customStyle="1" w:styleId="OtherTok">
+  <w:style w:customStyle="1" w:styleId="OtherTok" w:type="character">
     <w:name w:val="OtherTok"/>
     <w:basedOn w:val="VerbatimChar"/>
     <w:rPr>
       <w:color w:val="007020"/>
     </w:rPr>
   </w:style>
-  <w:style w:type="character" w:customStyle="1" w:styleId="FunctionTok">
+  <w:style w:customStyle="1" w:styleId="FunctionTok" w:type="character">
     <w:name w:val="FunctionTok"/>
     <w:basedOn w:val="VerbatimChar"/>
     <w:rPr>
       <w:color w:val="06287e"/>
     </w:rPr>
   </w:style>
-  <w:style w:type="character" w:customStyle="1" w:styleId="VariableTok">
+  <w:style w:customStyle="1" w:styleId="VariableTok" w:type="character">
     <w:name w:val="VariableTok"/>
     <w:basedOn w:val="VerbatimChar"/>
     <w:rPr>
       <w:color w:val="19177c"/>
     </w:rPr>
   </w:style>
-  <w:style w:type="character" w:customStyle="1" w:styleId="ControlFlowTok">
+  <w:style w:customStyle="1" w:styleId="ControlFlowTok" w:type="character">
     <w:name w:val="ControlFlowTok"/>
     <w:basedOn w:val="VerbatimChar"/>
     <w:rPr>
@@ -17697,45 +17733,45 @@
       <w:color w:val="007020"/>
     </w:rPr>
   </w:style>
-  <w:style w:type="character" w:customStyle="1" w:styleId="OperatorTok">
+  <w:style w:customStyle="1" w:styleId="OperatorTok" w:type="character">
     <w:name w:val="OperatorTok"/>
     <w:basedOn w:val="VerbatimChar"/>
     <w:rPr>
       <w:color w:val="666666"/>
     </w:rPr>
   </w:style>
-  <w:style w:type="character" w:customStyle="1" w:styleId="BuiltInTok">
+  <w:style w:customStyle="1" w:styleId="BuiltInTok" w:type="character">
     <w:name w:val="BuiltInTok"/>
     <w:basedOn w:val="VerbatimChar"/>
     <w:rPr>
       <w:color w:val="008000"/>
     </w:rPr>
   </w:style>
-  <w:style w:type="character" w:customStyle="1" w:styleId="ExtensionTok">
+  <w:style w:customStyle="1" w:styleId="ExtensionTok" w:type="character">
     <w:name w:val="ExtensionTok"/>
     <w:basedOn w:val="VerbatimChar"/>
     <w:rPr/>
   </w:style>
-  <w:style w:type="character" w:customStyle="1" w:styleId="PreprocessorTok">
+  <w:style w:customStyle="1" w:styleId="PreprocessorTok" w:type="character">
     <w:name w:val="PreprocessorTok"/>
     <w:basedOn w:val="VerbatimChar"/>
     <w:rPr>
       <w:color w:val="bc7a00"/>
     </w:rPr>
   </w:style>
-  <w:style w:type="character" w:customStyle="1" w:styleId="AttributeTok">
+  <w:style w:customStyle="1" w:styleId="AttributeTok" w:type="character">
     <w:name w:val="AttributeTok"/>
     <w:basedOn w:val="VerbatimChar"/>
     <w:rPr>
       <w:color w:val="7d9029"/>
     </w:rPr>
   </w:style>
-  <w:style w:type="character" w:customStyle="1" w:styleId="RegionMarkerTok">
+  <w:style w:customStyle="1" w:styleId="RegionMarkerTok" w:type="character">
     <w:name w:val="RegionMarkerTok"/>
     <w:basedOn w:val="VerbatimChar"/>
     <w:rPr/>
   </w:style>
-  <w:style w:type="character" w:customStyle="1" w:styleId="InformationTok">
+  <w:style w:customStyle="1" w:styleId="InformationTok" w:type="character">
     <w:name w:val="InformationTok"/>
     <w:basedOn w:val="VerbatimChar"/>
     <w:rPr>
@@ -17744,7 +17780,7 @@
       <w:color w:val="60a0b0"/>
     </w:rPr>
   </w:style>
-  <w:style w:type="character" w:customStyle="1" w:styleId="WarningTok">
+  <w:style w:customStyle="1" w:styleId="WarningTok" w:type="character">
     <w:name w:val="WarningTok"/>
     <w:basedOn w:val="VerbatimChar"/>
     <w:rPr>
@@ -17753,7 +17789,7 @@
       <w:color w:val="60a0b0"/>
     </w:rPr>
   </w:style>
-  <w:style w:type="character" w:customStyle="1" w:styleId="AlertTok">
+  <w:style w:customStyle="1" w:styleId="AlertTok" w:type="character">
     <w:name w:val="AlertTok"/>
     <w:basedOn w:val="VerbatimChar"/>
     <w:rPr>
@@ -17761,7 +17797,7 @@
       <w:color w:val="ff0000"/>
     </w:rPr>
   </w:style>
-  <w:style w:type="character" w:customStyle="1" w:styleId="ErrorTok">
+  <w:style w:customStyle="1" w:styleId="ErrorTok" w:type="character">
     <w:name w:val="ErrorTok"/>
     <w:basedOn w:val="VerbatimChar"/>
     <w:rPr>
@@ -17769,7 +17805,7 @@
       <w:color w:val="ff0000"/>
     </w:rPr>
   </w:style>
-  <w:style w:type="character" w:customStyle="1" w:styleId="NormalTok">
+  <w:style w:customStyle="1" w:styleId="NormalTok" w:type="character">
     <w:name w:val="NormalTok"/>
     <w:basedOn w:val="VerbatimChar"/>
     <w:rPr/>

</xml_diff>

<commit_message>
docs: regenerate the PDF and Word of evidences 01 to 08 with diagrams and table images
</commit_message>
<xml_diff>
--- a/03_PROPUESTA_TECNICA_DEL_SOFTWARE/EN/WORD/03_Software_Technical_Proposal.docx
+++ b/03_PROPUESTA_TECNICA_DEL_SOFTWARE/EN/WORD/03_Software_Technical_Proposal.docx
@@ -2,7 +2,7 @@
 <file path=word/document.xml><?xml version="1.0" encoding="utf-8"?>
 <w:document xmlns:w="http://schemas.openxmlformats.org/wordprocessingml/2006/main" xmlns:m="http://schemas.openxmlformats.org/officeDocument/2006/math" xmlns:r="http://schemas.openxmlformats.org/officeDocument/2006/relationships" xmlns:o="urn:schemas-microsoft-com:office:office" xmlns:v="urn:schemas-microsoft-com:vml" xmlns:w10="urn:schemas-microsoft-com:office:word" xmlns:a="http://schemas.openxmlformats.org/drawingml/2006/main" xmlns:pic="http://schemas.openxmlformats.org/drawingml/2006/picture" xmlns:wp="http://schemas.openxmlformats.org/drawingml/2006/wordprocessingDrawing">
   <w:body>
-    <w:bookmarkStart w:id="72" w:name="Xcb8bf84fb5186dc0581698eb0ad2251cbcae1ac"/>
+    <w:bookmarkStart w:id="61" w:name="Xcb8bf84fb5186dc0581698eb0ad2251cbcae1ac"/>
     <w:p>
       <w:pPr>
         <w:pStyle w:val="Heading1"/>
@@ -48,7 +48,7 @@
         <w:pStyle w:val="BodyText"/>
       </w:pPr>
       <w:r>
-        <w:t xml:space="preserve">Version 1.3, October 20, 2026</w:t>
+        <w:t xml:space="preserve">Version 1.4, October 21, 2026</w:t>
       </w:r>
     </w:p>
     <w:p>
@@ -58,7 +58,7 @@
         </w:pict>
       </w:r>
     </w:p>
-    <w:bookmarkStart w:id="20" w:name="abstract"/>
+    <w:bookmarkStart w:id="9" w:name="abstract"/>
     <w:p>
       <w:pPr>
         <w:pStyle w:val="Heading2"/>
@@ -130,8 +130,8 @@
         </w:pict>
       </w:r>
     </w:p>
-    <w:bookmarkEnd w:id="20"/>
-    <w:bookmarkStart w:id="24" w:name="X21cb320b7276edb79af59ad9fcc6b5508ef6a9e"/>
+    <w:bookmarkEnd w:id="9"/>
+    <w:bookmarkStart w:id="13" w:name="X21cb320b7276edb79af59ad9fcc6b5508ef6a9e"/>
     <w:p>
       <w:pPr>
         <w:pStyle w:val="Heading2"/>
@@ -193,20 +193,20 @@
       <w:r>
         <w:drawing>
           <wp:inline>
-            <wp:extent cx="5334000" cy="7936871"/>
+            <wp:extent cx="5334000" cy="7046148"/>
             <wp:effectExtent b="0" l="0" r="0" t="0"/>
-            <wp:docPr descr="" title="" id="22" name="Picture"/>
+            <wp:docPr descr="Diagrama" title="" id="11" name="Picture"/>
             <a:graphic>
               <a:graphicData uri="http://schemas.openxmlformats.org/drawingml/2006/picture">
                 <pic:pic>
                   <pic:nvPicPr>
-                    <pic:cNvPr descr="diagrama-1.png" id="23" name="Picture"/>
+                    <pic:cNvPr descr="C:/Users/MERARI~1/AppData/Local/Temp/claude/C--Users-MERARI-URBANO-Lavado-Vehicular/fbac9d65-987c-4365-8841-0c86e8c3ca54/scratchpad/mermaid/software_technical_proposal_md-1.png" id="12" name="Picture"/>
                     <pic:cNvPicPr>
                       <a:picLocks noChangeArrowheads="1" noChangeAspect="1"/>
                     </pic:cNvPicPr>
                   </pic:nvPicPr>
                   <pic:blipFill>
-                    <a:blip r:embed="rId21"/>
+                    <a:blip r:embed="rId10"/>
                     <a:stretch>
                       <a:fillRect/>
                     </a:stretch>
@@ -214,7 +214,7 @@
                   <pic:spPr bwMode="auto">
                     <a:xfrm>
                       <a:off x="0" y="0"/>
-                      <a:ext cx="5334000" cy="7936871"/>
+                      <a:ext cx="5334000" cy="7046148"/>
                     </a:xfrm>
                     <a:prstGeom prst="rect">
                       <a:avLst/>
@@ -308,8 +308,8 @@
         </w:pict>
       </w:r>
     </w:p>
-    <w:bookmarkEnd w:id="24"/>
-    <w:bookmarkStart w:id="25" w:name="Xc49d3e94e808f4869f88dd580e155e2d14cbb93"/>
+    <w:bookmarkEnd w:id="13"/>
+    <w:bookmarkStart w:id="14" w:name="Xc49d3e94e808f4869f88dd580e155e2d14cbb93"/>
     <w:p>
       <w:pPr>
         <w:pStyle w:val="Heading2"/>
@@ -782,8 +782,8 @@
         </w:pict>
       </w:r>
     </w:p>
-    <w:bookmarkEnd w:id="25"/>
-    <w:bookmarkStart w:id="26" w:name="Xc0368dfbebe0433d23458dcf349963a25db07f5"/>
+    <w:bookmarkEnd w:id="14"/>
+    <w:bookmarkStart w:id="15" w:name="Xc0368dfbebe0433d23458dcf349963a25db07f5"/>
     <w:p>
       <w:pPr>
         <w:pStyle w:val="Heading2"/>
@@ -1125,8 +1125,8 @@
         </w:pict>
       </w:r>
     </w:p>
-    <w:bookmarkEnd w:id="26"/>
-    <w:bookmarkStart w:id="31" w:name="Xc9bd4e1ed7f05a1003d72cb34ddc13f04a1ade0"/>
+    <w:bookmarkEnd w:id="15"/>
+    <w:bookmarkStart w:id="20" w:name="Xc9bd4e1ed7f05a1003d72cb34ddc13f04a1ade0"/>
     <w:p>
       <w:pPr>
         <w:pStyle w:val="Heading2"/>
@@ -1135,7 +1135,7 @@
         <w:t xml:space="preserve">4. Hardware and Software Requirements</w:t>
       </w:r>
     </w:p>
-    <w:bookmarkStart w:id="27" w:name="Xd5a8830c7e0a058a7831210ff210d5e6c1f08b3"/>
+    <w:bookmarkStart w:id="16" w:name="Xd5a8830c7e0a058a7831210ff210d5e6c1f08b3"/>
     <w:p>
       <w:pPr>
         <w:pStyle w:val="Heading3"/>
@@ -1356,8 +1356,8 @@
         </w:tc>
       </w:tr>
     </w:tbl>
-    <w:bookmarkEnd w:id="27"/>
-    <w:bookmarkStart w:id="28" w:name="X2e8fa92e096bac358f1efea5ffe91374b533f2c"/>
+    <w:bookmarkEnd w:id="16"/>
+    <w:bookmarkStart w:id="17" w:name="X2e8fa92e096bac358f1efea5ffe91374b533f2c"/>
     <w:p>
       <w:pPr>
         <w:pStyle w:val="Heading3"/>
@@ -1727,8 +1727,8 @@
         </w:tc>
       </w:tr>
     </w:tbl>
-    <w:bookmarkEnd w:id="28"/>
-    <w:bookmarkStart w:id="29" w:name="X39a532bdadc0ee0acd95dd7988d70dbcf9e36f7"/>
+    <w:bookmarkEnd w:id="17"/>
+    <w:bookmarkStart w:id="18" w:name="X39a532bdadc0ee0acd95dd7988d70dbcf9e36f7"/>
     <w:p>
       <w:pPr>
         <w:pStyle w:val="Heading3"/>
@@ -1940,7 +1940,7 @@
           <w:b/>
           <w:bCs/>
         </w:rPr>
-        <w:t xml:space="preserve">Follow-up as of October 17, 2026.</w:t>
+        <w:t xml:space="preserve">Follow-up as of October 21, 2026.</w:t>
       </w:r>
       <w:r>
         <w:t xml:space="preserve"> </w:t>
@@ -1987,11 +1987,11 @@
         <w:t xml:space="preserve"> </w:t>
       </w:r>
       <w:r>
-        <w:t xml:space="preserve">also has a manual workflow that updates the server.</w:t>
+        <w:t xml:space="preserve">also has a manual workflow that updates the server. Since October 20 and 21 the server backs up the database every day and before every update, checks each backup with a test restore and keeps the last 14; Caddy sends security headers and a content security policy; Docker checks the health of every container and caps the size of their logs. Since October 21 the API Gateway also cuts the tokens of closed sessions by asking security-service, with the answer kept 30 seconds per token, without changing the decision to use JWT.</w:t>
       </w:r>
     </w:p>
-    <w:bookmarkEnd w:id="29"/>
-    <w:bookmarkStart w:id="30" w:name="X40fc8b0ae8aa6259c2932519e0af4277a4161f3"/>
+    <w:bookmarkEnd w:id="18"/>
+    <w:bookmarkStart w:id="19" w:name="X40fc8b0ae8aa6259c2932519e0af4277a4161f3"/>
     <w:p>
       <w:pPr>
         <w:pStyle w:val="Heading3"/>
@@ -2227,9 +2227,9 @@
         </w:pict>
       </w:r>
     </w:p>
-    <w:bookmarkEnd w:id="30"/>
-    <w:bookmarkEnd w:id="31"/>
-    <w:bookmarkStart w:id="32" w:name="X82eb1247d730b77191b20da384467600c9190de"/>
+    <w:bookmarkEnd w:id="19"/>
+    <w:bookmarkEnd w:id="20"/>
+    <w:bookmarkStart w:id="21" w:name="X82eb1247d730b77191b20da384467600c9190de"/>
     <w:p>
       <w:pPr>
         <w:pStyle w:val="Heading2"/>
@@ -3520,8 +3520,8 @@
         </w:pict>
       </w:r>
     </w:p>
-    <w:bookmarkEnd w:id="32"/>
-    <w:bookmarkStart w:id="42" w:name="Xff0f04bdee79ccfef6d6a0b240cba1b13922e13"/>
+    <w:bookmarkEnd w:id="21"/>
+    <w:bookmarkStart w:id="31" w:name="Xff0f04bdee79ccfef6d6a0b240cba1b13922e13"/>
     <w:p>
       <w:pPr>
         <w:pStyle w:val="Heading2"/>
@@ -4500,7 +4500,7 @@
         <w:t xml:space="preserve">W = project week; week 1 is the week the contract is signed. Each week has 5 working days of 8 hours. █ = week with work in the phase; ◆ = milestone. The effort adds up the hours of everyone involved.</w:t>
       </w:r>
     </w:p>
-    <w:bookmarkStart w:id="33" w:name="phase-1-kickoff-and-requirements-w1w3"/>
+    <w:bookmarkStart w:id="22" w:name="phase-1-kickoff-and-requirements-w1w3"/>
     <w:p>
       <w:pPr>
         <w:pStyle w:val="Heading4"/>
@@ -5028,8 +5028,8 @@
         </w:tc>
       </w:tr>
     </w:tbl>
-    <w:bookmarkEnd w:id="33"/>
-    <w:bookmarkStart w:id="34" w:name="phase-2-analysis-and-design-w4w6"/>
+    <w:bookmarkEnd w:id="22"/>
+    <w:bookmarkStart w:id="23" w:name="phase-2-analysis-and-design-w4w6"/>
     <w:p>
       <w:pPr>
         <w:pStyle w:val="Heading4"/>
@@ -5715,8 +5715,8 @@
         </w:tc>
       </w:tr>
     </w:tbl>
-    <w:bookmarkEnd w:id="34"/>
-    <w:bookmarkStart w:id="35" w:name="phase-3-technical-foundation-w5w7"/>
+    <w:bookmarkEnd w:id="23"/>
+    <w:bookmarkStart w:id="24" w:name="phase-3-technical-foundation-w5w7"/>
     <w:p>
       <w:pPr>
         <w:pStyle w:val="Heading4"/>
@@ -6240,8 +6240,8 @@
         </w:tc>
       </w:tr>
     </w:tbl>
-    <w:bookmarkEnd w:id="35"/>
-    <w:bookmarkStart w:id="36" w:name="phase-4-backend-construction-w7w17"/>
+    <w:bookmarkEnd w:id="24"/>
+    <w:bookmarkStart w:id="25" w:name="phase-4-backend-construction-w7w17"/>
     <w:p>
       <w:pPr>
         <w:pStyle w:val="Heading4"/>
@@ -7322,8 +7322,8 @@
         </w:tc>
       </w:tr>
     </w:tbl>
-    <w:bookmarkEnd w:id="36"/>
-    <w:bookmarkStart w:id="37" w:name="phase-5-web-app-construction-w7w18"/>
+    <w:bookmarkEnd w:id="25"/>
+    <w:bookmarkStart w:id="26" w:name="phase-5-web-app-construction-w7w18"/>
     <w:p>
       <w:pPr>
         <w:pStyle w:val="Heading4"/>
@@ -7768,8 +7768,8 @@
         </w:tc>
       </w:tr>
     </w:tbl>
-    <w:bookmarkEnd w:id="37"/>
-    <w:bookmarkStart w:id="38" w:name="phase-6-mobile-app-construction-w10w18"/>
+    <w:bookmarkEnd w:id="26"/>
+    <w:bookmarkStart w:id="27" w:name="phase-6-mobile-app-construction-w10w18"/>
     <w:p>
       <w:pPr>
         <w:pStyle w:val="Heading4"/>
@@ -8293,8 +8293,8 @@
         </w:tc>
       </w:tr>
     </w:tbl>
-    <w:bookmarkEnd w:id="38"/>
-    <w:bookmarkStart w:id="39" w:name="phase-7-testing-w6w23"/>
+    <w:bookmarkEnd w:id="27"/>
+    <w:bookmarkStart w:id="28" w:name="phase-7-testing-w6w23"/>
     <w:p>
       <w:pPr>
         <w:pStyle w:val="Heading4"/>
@@ -9059,8 +9059,8 @@
         </w:tc>
       </w:tr>
     </w:tbl>
-    <w:bookmarkEnd w:id="39"/>
-    <w:bookmarkStart w:id="40" w:name="phase-8-deployment-and-go-live-w18w23"/>
+    <w:bookmarkEnd w:id="28"/>
+    <w:bookmarkStart w:id="29" w:name="phase-8-deployment-and-go-live-w18w23"/>
     <w:p>
       <w:pPr>
         <w:pStyle w:val="Heading4"/>
@@ -9825,8 +9825,8 @@
         </w:tc>
       </w:tr>
     </w:tbl>
-    <w:bookmarkEnd w:id="40"/>
-    <w:bookmarkStart w:id="41" w:name="phase-9-stabilization-and-closure-w24w28"/>
+    <w:bookmarkEnd w:id="29"/>
+    <w:bookmarkStart w:id="30" w:name="phase-9-stabilization-and-closure-w24w28"/>
     <w:p>
       <w:pPr>
         <w:pStyle w:val="Heading4"/>
@@ -10203,9 +10203,9 @@
         </w:pict>
       </w:r>
     </w:p>
-    <w:bookmarkEnd w:id="41"/>
-    <w:bookmarkEnd w:id="42"/>
-    <w:bookmarkStart w:id="43" w:name="X8d56e0807c0bc0d857e3256cda774cc4156c22e"/>
+    <w:bookmarkEnd w:id="30"/>
+    <w:bookmarkEnd w:id="31"/>
+    <w:bookmarkStart w:id="32" w:name="X8d56e0807c0bc0d857e3256cda774cc4156c22e"/>
     <w:p>
       <w:pPr>
         <w:pStyle w:val="Heading2"/>
@@ -10869,8 +10869,8 @@
         </w:pict>
       </w:r>
     </w:p>
-    <w:bookmarkEnd w:id="43"/>
-    <w:bookmarkStart w:id="49" w:name="X069d71f853c0895f33c2fb192289fea3f1b87e5"/>
+    <w:bookmarkEnd w:id="32"/>
+    <w:bookmarkStart w:id="38" w:name="X069d71f853c0895f33c2fb192289fea3f1b87e5"/>
     <w:p>
       <w:pPr>
         <w:pStyle w:val="Heading2"/>
@@ -11161,7 +11161,7 @@
         </w:tc>
       </w:tr>
     </w:tbl>
-    <w:bookmarkStart w:id="44" w:name="Xfb6522b4ada438d098da2753c24e46d67147172"/>
+    <w:bookmarkStart w:id="33" w:name="Xfb6522b4ada438d098da2753c24e46d67147172"/>
     <w:p>
       <w:pPr>
         <w:pStyle w:val="Heading3"/>
@@ -11825,8 +11825,8 @@
         </w:tc>
       </w:tr>
     </w:tbl>
-    <w:bookmarkEnd w:id="44"/>
-    <w:bookmarkStart w:id="45" w:name="X7d6e1e7e7203e8faedd3f299667bdeaa96720e8"/>
+    <w:bookmarkEnd w:id="33"/>
+    <w:bookmarkStart w:id="34" w:name="X7d6e1e7e7203e8faedd3f299667bdeaa96720e8"/>
     <w:p>
       <w:pPr>
         <w:pStyle w:val="Heading3"/>
@@ -12347,8 +12347,8 @@
         </w:tc>
       </w:tr>
     </w:tbl>
-    <w:bookmarkEnd w:id="45"/>
-    <w:bookmarkStart w:id="46" w:name="X75ec9c0645f1e5241f32d56658351ad6c9e84fd"/>
+    <w:bookmarkEnd w:id="34"/>
+    <w:bookmarkStart w:id="35" w:name="X75ec9c0645f1e5241f32d56658351ad6c9e84fd"/>
     <w:p>
       <w:pPr>
         <w:pStyle w:val="Heading3"/>
@@ -13209,8 +13209,8 @@
         </w:tc>
       </w:tr>
     </w:tbl>
-    <w:bookmarkEnd w:id="46"/>
-    <w:bookmarkStart w:id="47" w:name="X4f4e63a24caf35cb1db9bc331f5eb01b5e0819b"/>
+    <w:bookmarkEnd w:id="35"/>
+    <w:bookmarkStart w:id="36" w:name="X4f4e63a24caf35cb1db9bc331f5eb01b5e0819b"/>
     <w:p>
       <w:pPr>
         <w:pStyle w:val="Heading3"/>
@@ -13663,8 +13663,8 @@
         </w:tc>
       </w:tr>
     </w:tbl>
-    <w:bookmarkEnd w:id="47"/>
-    <w:bookmarkStart w:id="48" w:name="Xc54d8f940de273ba636c4b6beefbbd03dbf7b59"/>
+    <w:bookmarkEnd w:id="36"/>
+    <w:bookmarkStart w:id="37" w:name="Xc54d8f940de273ba636c4b6beefbbd03dbf7b59"/>
     <w:p>
       <w:pPr>
         <w:pStyle w:val="Heading3"/>
@@ -13924,9 +13924,9 @@
         </w:pict>
       </w:r>
     </w:p>
-    <w:bookmarkEnd w:id="48"/>
-    <w:bookmarkEnd w:id="49"/>
-    <w:bookmarkStart w:id="50" w:name="X18de76301d15c44fa67693ac4bb7c458a55cd74"/>
+    <w:bookmarkEnd w:id="37"/>
+    <w:bookmarkEnd w:id="38"/>
+    <w:bookmarkStart w:id="39" w:name="X18de76301d15c44fa67693ac4bb7c458a55cd74"/>
     <w:p>
       <w:pPr>
         <w:pStyle w:val="Heading2"/>
@@ -14657,8 +14657,8 @@
         </w:pict>
       </w:r>
     </w:p>
-    <w:bookmarkEnd w:id="50"/>
-    <w:bookmarkStart w:id="51" w:name="Xc930717707498e18031d61b5c2c30fa47ce902f"/>
+    <w:bookmarkEnd w:id="39"/>
+    <w:bookmarkStart w:id="40" w:name="Xc930717707498e18031d61b5c2c30fa47ce902f"/>
     <w:p>
       <w:pPr>
         <w:pStyle w:val="Heading2"/>
@@ -14824,8 +14824,8 @@
         </w:pict>
       </w:r>
     </w:p>
-    <w:bookmarkEnd w:id="51"/>
-    <w:bookmarkStart w:id="52" w:name="X966374c2a461b484688544bade474c44f846409"/>
+    <w:bookmarkEnd w:id="40"/>
+    <w:bookmarkStart w:id="41" w:name="X966374c2a461b484688544bade474c44f846409"/>
     <w:p>
       <w:pPr>
         <w:pStyle w:val="Heading2"/>
@@ -15385,8 +15385,8 @@
         </w:pict>
       </w:r>
     </w:p>
-    <w:bookmarkEnd w:id="52"/>
-    <w:bookmarkStart w:id="53" w:name="X2464789d46b9f814a58a3e4bc9bdc37755e36c8"/>
+    <w:bookmarkEnd w:id="41"/>
+    <w:bookmarkStart w:id="42" w:name="X2464789d46b9f814a58a3e4bc9bdc37755e36c8"/>
     <w:p>
       <w:pPr>
         <w:pStyle w:val="Heading2"/>
@@ -15966,8 +15966,8 @@
         </w:pict>
       </w:r>
     </w:p>
-    <w:bookmarkEnd w:id="53"/>
-    <w:bookmarkStart w:id="71" w:name="references"/>
+    <w:bookmarkEnd w:id="42"/>
+    <w:bookmarkStart w:id="60" w:name="references"/>
     <w:p>
       <w:pPr>
         <w:pStyle w:val="Heading2"/>
@@ -15999,7 +15999,7 @@
       <w:r>
         <w:t xml:space="preserve"> </w:t>
       </w:r>
-      <w:hyperlink r:id="rId54">
+      <w:hyperlink r:id="rId43">
         <w:r>
           <w:rPr>
             <w:rStyle w:val="Hyperlink"/>
@@ -16031,7 +16031,7 @@
       <w:r>
         <w:t xml:space="preserve"> </w:t>
       </w:r>
-      <w:hyperlink r:id="rId55">
+      <w:hyperlink r:id="rId44">
         <w:r>
           <w:rPr>
             <w:rStyle w:val="Hyperlink"/>
@@ -16066,7 +16066,7 @@
       <w:r>
         <w:t xml:space="preserve"> </w:t>
       </w:r>
-      <w:hyperlink r:id="rId56">
+      <w:hyperlink r:id="rId45">
         <w:r>
           <w:rPr>
             <w:rStyle w:val="Hyperlink"/>
@@ -16101,7 +16101,7 @@
       <w:r>
         <w:t xml:space="preserve"> </w:t>
       </w:r>
-      <w:hyperlink r:id="rId57">
+      <w:hyperlink r:id="rId46">
         <w:r>
           <w:rPr>
             <w:rStyle w:val="Hyperlink"/>
@@ -16133,7 +16133,7 @@
       <w:r>
         <w:t xml:space="preserve"> </w:t>
       </w:r>
-      <w:hyperlink r:id="rId58">
+      <w:hyperlink r:id="rId47">
         <w:r>
           <w:rPr>
             <w:rStyle w:val="Hyperlink"/>
@@ -16168,7 +16168,7 @@
       <w:r>
         <w:t xml:space="preserve"> </w:t>
       </w:r>
-      <w:hyperlink r:id="rId59">
+      <w:hyperlink r:id="rId48">
         <w:r>
           <w:rPr>
             <w:rStyle w:val="Hyperlink"/>
@@ -16203,7 +16203,7 @@
       <w:r>
         <w:t xml:space="preserve"> </w:t>
       </w:r>
-      <w:hyperlink r:id="rId60">
+      <w:hyperlink r:id="rId49">
         <w:r>
           <w:rPr>
             <w:rStyle w:val="Hyperlink"/>
@@ -16235,7 +16235,7 @@
       <w:r>
         <w:t xml:space="preserve"> </w:t>
       </w:r>
-      <w:hyperlink r:id="rId61">
+      <w:hyperlink r:id="rId50">
         <w:r>
           <w:rPr>
             <w:rStyle w:val="Hyperlink"/>
@@ -16270,7 +16270,7 @@
       <w:r>
         <w:t xml:space="preserve"> </w:t>
       </w:r>
-      <w:hyperlink r:id="rId62">
+      <w:hyperlink r:id="rId51">
         <w:r>
           <w:rPr>
             <w:rStyle w:val="Hyperlink"/>
@@ -16329,7 +16329,7 @@
       <w:r>
         <w:t xml:space="preserve"> </w:t>
       </w:r>
-      <w:hyperlink r:id="rId63">
+      <w:hyperlink r:id="rId52">
         <w:r>
           <w:rPr>
             <w:rStyle w:val="Hyperlink"/>
@@ -16364,7 +16364,7 @@
       <w:r>
         <w:t xml:space="preserve"> </w:t>
       </w:r>
-      <w:hyperlink r:id="rId64">
+      <w:hyperlink r:id="rId53">
         <w:r>
           <w:rPr>
             <w:rStyle w:val="Hyperlink"/>
@@ -16399,7 +16399,7 @@
       <w:r>
         <w:t xml:space="preserve"> </w:t>
       </w:r>
-      <w:hyperlink r:id="rId65">
+      <w:hyperlink r:id="rId54">
         <w:r>
           <w:rPr>
             <w:rStyle w:val="Hyperlink"/>
@@ -16431,7 +16431,7 @@
       <w:r>
         <w:t xml:space="preserve"> </w:t>
       </w:r>
-      <w:hyperlink r:id="rId66">
+      <w:hyperlink r:id="rId55">
         <w:r>
           <w:rPr>
             <w:rStyle w:val="Hyperlink"/>
@@ -16463,7 +16463,7 @@
       <w:r>
         <w:t xml:space="preserve"> </w:t>
       </w:r>
-      <w:hyperlink r:id="rId67">
+      <w:hyperlink r:id="rId56">
         <w:r>
           <w:rPr>
             <w:rStyle w:val="Hyperlink"/>
@@ -16498,7 +16498,7 @@
       <w:r>
         <w:t xml:space="preserve"> </w:t>
       </w:r>
-      <w:hyperlink r:id="rId68">
+      <w:hyperlink r:id="rId57">
         <w:r>
           <w:rPr>
             <w:rStyle w:val="Hyperlink"/>
@@ -16533,7 +16533,7 @@
       <w:r>
         <w:t xml:space="preserve"> </w:t>
       </w:r>
-      <w:hyperlink r:id="rId69">
+      <w:hyperlink r:id="rId58">
         <w:r>
           <w:rPr>
             <w:rStyle w:val="Hyperlink"/>
@@ -16565,7 +16565,7 @@
       <w:r>
         <w:t xml:space="preserve"> </w:t>
       </w:r>
-      <w:hyperlink r:id="rId70">
+      <w:hyperlink r:id="rId59">
         <w:r>
           <w:rPr>
             <w:rStyle w:val="Hyperlink"/>
@@ -16574,8 +16574,8 @@
         </w:r>
       </w:hyperlink>
     </w:p>
-    <w:bookmarkEnd w:id="71"/>
-    <w:bookmarkEnd w:id="72"/>
+    <w:bookmarkEnd w:id="60"/>
+    <w:bookmarkEnd w:id="61"/>
     <w:sectPr>
       <w:footnotePr>
         <w:numRestart w:val="eachSect"/>

</xml_diff>

<commit_message>
docs(proposal): regenerate the PDF and Word
</commit_message>
<xml_diff>
--- a/03_PROPUESTA_TECNICA_DEL_SOFTWARE/EN/WORD/03_Software_Technical_Proposal.docx
+++ b/03_PROPUESTA_TECNICA_DEL_SOFTWARE/EN/WORD/03_Software_Technical_Proposal.docx
@@ -2,7 +2,7 @@
 <file path=word/document.xml><?xml version="1.0" encoding="utf-8"?>
 <w:document xmlns:w="http://schemas.openxmlformats.org/wordprocessingml/2006/main" xmlns:m="http://schemas.openxmlformats.org/officeDocument/2006/math" xmlns:r="http://schemas.openxmlformats.org/officeDocument/2006/relationships" xmlns:o="urn:schemas-microsoft-com:office:office" xmlns:v="urn:schemas-microsoft-com:vml" xmlns:w10="urn:schemas-microsoft-com:office:word" xmlns:a="http://schemas.openxmlformats.org/drawingml/2006/main" xmlns:pic="http://schemas.openxmlformats.org/drawingml/2006/picture" xmlns:wp="http://schemas.openxmlformats.org/drawingml/2006/wordprocessingDrawing">
   <w:body>
-    <w:bookmarkStart w:id="61" w:name="Xcb8bf84fb5186dc0581698eb0ad2251cbcae1ac"/>
+    <w:bookmarkStart w:id="58" w:name="Xcb8bf84fb5186dc0581698eb0ad2251cbcae1ac"/>
     <w:p>
       <w:pPr>
         <w:pStyle w:val="Heading1"/>
@@ -48,7 +48,7 @@
         <w:pStyle w:val="BodyText"/>
       </w:pPr>
       <w:r>
-        <w:t xml:space="preserve">Version 1.4, October 21, 2026</w:t>
+        <w:t xml:space="preserve">Version 1.5, October 27, 2026</w:t>
       </w:r>
     </w:p>
     <w:p>
@@ -131,7 +131,7 @@
       </w:r>
     </w:p>
     <w:bookmarkEnd w:id="9"/>
-    <w:bookmarkStart w:id="13" w:name="X21cb320b7276edb79af59ad9fcc6b5508ef6a9e"/>
+    <w:bookmarkStart w:id="10" w:name="X21cb320b7276edb79af59ad9fcc6b5508ef6a9e"/>
     <w:p>
       <w:pPr>
         <w:pStyle w:val="Heading2"/>
@@ -191,46 +191,7 @@
         <w:pStyle w:val="BodyText"/>
       </w:pPr>
       <w:r>
-        <w:drawing>
-          <wp:inline>
-            <wp:extent cx="5334000" cy="7046148"/>
-            <wp:effectExtent b="0" l="0" r="0" t="0"/>
-            <wp:docPr descr="Diagrama" title="" id="11" name="Picture"/>
-            <a:graphic>
-              <a:graphicData uri="http://schemas.openxmlformats.org/drawingml/2006/picture">
-                <pic:pic>
-                  <pic:nvPicPr>
-                    <pic:cNvPr descr="C:/Users/MERARI~1/AppData/Local/Temp/claude/C--Users-MERARI-URBANO-Lavado-Vehicular/fbac9d65-987c-4365-8841-0c86e8c3ca54/scratchpad/mermaid/software_technical_proposal_md-1.png" id="12" name="Picture"/>
-                    <pic:cNvPicPr>
-                      <a:picLocks noChangeArrowheads="1" noChangeAspect="1"/>
-                    </pic:cNvPicPr>
-                  </pic:nvPicPr>
-                  <pic:blipFill>
-                    <a:blip r:embed="rId10"/>
-                    <a:stretch>
-                      <a:fillRect/>
-                    </a:stretch>
-                  </pic:blipFill>
-                  <pic:spPr bwMode="auto">
-                    <a:xfrm>
-                      <a:off x="0" y="0"/>
-                      <a:ext cx="5334000" cy="7046148"/>
-                    </a:xfrm>
-                    <a:prstGeom prst="rect">
-                      <a:avLst/>
-                    </a:prstGeom>
-                    <a:noFill/>
-                    <a:ln w="9525">
-                      <a:noFill/>
-                      <a:headEnd/>
-                      <a:tailEnd/>
-                    </a:ln>
-                  </pic:spPr>
-                </pic:pic>
-              </a:graphicData>
-            </a:graphic>
-          </wp:inline>
-        </w:drawing>
+        <w:t xml:space="preserve">![Diagrama](C:/Users/JUAN CAMILO/Documents/PROYECTO FINAL_LAVADO VEICULAR/lavarapido-docs/_generador/work/mermaid/software_technical_proposal_md-1.png)</w:t>
       </w:r>
     </w:p>
     <w:p>
@@ -308,8 +269,8 @@
         </w:pict>
       </w:r>
     </w:p>
-    <w:bookmarkEnd w:id="13"/>
-    <w:bookmarkStart w:id="14" w:name="Xc49d3e94e808f4869f88dd580e155e2d14cbb93"/>
+    <w:bookmarkEnd w:id="10"/>
+    <w:bookmarkStart w:id="11" w:name="Xc49d3e94e808f4869f88dd580e155e2d14cbb93"/>
     <w:p>
       <w:pPr>
         <w:pStyle w:val="Heading2"/>
@@ -782,8 +743,8 @@
         </w:pict>
       </w:r>
     </w:p>
-    <w:bookmarkEnd w:id="14"/>
-    <w:bookmarkStart w:id="15" w:name="Xc0368dfbebe0433d23458dcf349963a25db07f5"/>
+    <w:bookmarkEnd w:id="11"/>
+    <w:bookmarkStart w:id="12" w:name="Xc0368dfbebe0433d23458dcf349963a25db07f5"/>
     <w:p>
       <w:pPr>
         <w:pStyle w:val="Heading2"/>
@@ -1125,8 +1086,8 @@
         </w:pict>
       </w:r>
     </w:p>
-    <w:bookmarkEnd w:id="15"/>
-    <w:bookmarkStart w:id="20" w:name="Xc9bd4e1ed7f05a1003d72cb34ddc13f04a1ade0"/>
+    <w:bookmarkEnd w:id="12"/>
+    <w:bookmarkStart w:id="17" w:name="Xc9bd4e1ed7f05a1003d72cb34ddc13f04a1ade0"/>
     <w:p>
       <w:pPr>
         <w:pStyle w:val="Heading2"/>
@@ -1135,7 +1096,7 @@
         <w:t xml:space="preserve">4. Hardware and Software Requirements</w:t>
       </w:r>
     </w:p>
-    <w:bookmarkStart w:id="16" w:name="Xd5a8830c7e0a058a7831210ff210d5e6c1f08b3"/>
+    <w:bookmarkStart w:id="13" w:name="Xd5a8830c7e0a058a7831210ff210d5e6c1f08b3"/>
     <w:p>
       <w:pPr>
         <w:pStyle w:val="Heading3"/>
@@ -1356,8 +1317,8 @@
         </w:tc>
       </w:tr>
     </w:tbl>
-    <w:bookmarkEnd w:id="16"/>
-    <w:bookmarkStart w:id="17" w:name="X2e8fa92e096bac358f1efea5ffe91374b533f2c"/>
+    <w:bookmarkEnd w:id="13"/>
+    <w:bookmarkStart w:id="14" w:name="X2e8fa92e096bac358f1efea5ffe91374b533f2c"/>
     <w:p>
       <w:pPr>
         <w:pStyle w:val="Heading3"/>
@@ -1727,8 +1688,8 @@
         </w:tc>
       </w:tr>
     </w:tbl>
-    <w:bookmarkEnd w:id="17"/>
-    <w:bookmarkStart w:id="18" w:name="X39a532bdadc0ee0acd95dd7988d70dbcf9e36f7"/>
+    <w:bookmarkEnd w:id="14"/>
+    <w:bookmarkStart w:id="15" w:name="X39a532bdadc0ee0acd95dd7988d70dbcf9e36f7"/>
     <w:p>
       <w:pPr>
         <w:pStyle w:val="Heading3"/>
@@ -1940,7 +1901,7 @@
           <w:b/>
           <w:bCs/>
         </w:rPr>
-        <w:t xml:space="preserve">Follow-up as of October 21, 2026.</w:t>
+        <w:t xml:space="preserve">Follow-up as of October 27, 2026.</w:t>
       </w:r>
       <w:r>
         <w:t xml:space="preserve"> </w:t>
@@ -1972,7 +1933,19 @@
         <w:t xml:space="preserve">/app</w:t>
       </w:r>
       <w:r>
-        <w:t xml:space="preserve">. With every container running it uses about 3.3 GB of RAM, so the production size of Table 5 is still comfortable. The full procedure is in the Deployment Document (folder 07). In the academic project, continuous integration was not done with Jenkins but with GitHub Actions: the 10 code repositories build and run their tests on every change, and</w:t>
+        <w:t xml:space="preserve">. With every container running it uses about 3.3 GB of RAM, so the production size of Table 5 is still comfortable. The full procedure is in the Deployment Document (folder 07). In the academic project, continuous integration was not done with Jenkins but with GitHub Actions: the 10 code repositories build and run their tests on every change, and since October 26, 2026 continuous deployment is active: each approved merge into</w:t>
+      </w:r>
+      <w:r>
+        <w:t xml:space="preserve"> </w:t>
+      </w:r>
+      <w:r>
+        <w:rPr>
+          <w:rStyle w:val="VerbatimChar"/>
+        </w:rPr>
+        <w:t xml:space="preserve">main</w:t>
+      </w:r>
+      <w:r>
+        <w:t xml:space="preserve">, a protected branch in the 10 repositories, asks the "Desplegar en Azure" workflow of</w:t>
       </w:r>
       <w:r>
         <w:t xml:space="preserve"> </w:t>
@@ -1987,11 +1960,23 @@
         <w:t xml:space="preserve"> </w:t>
       </w:r>
       <w:r>
-        <w:t xml:space="preserve">also has a manual workflow that updates the server. Since October 20 and 21 the server backs up the database every day and before every update, checks each backup with a test restore and keeps the last 14; Caddy sends security headers and a content security policy; Docker checks the health of every container and caps the size of their logs. Since October 21 the API Gateway also cuts the tokens of closed sessions by asking security-service, with the answer kept 30 seconds per token, without changing the decision to use JWT.</w:t>
+        <w:t xml:space="preserve">to update the server, which runs what is in</w:t>
+      </w:r>
+      <w:r>
+        <w:t xml:space="preserve"> </w:t>
+      </w:r>
+      <w:r>
+        <w:rPr>
+          <w:rStyle w:val="VerbatimChar"/>
+        </w:rPr>
+        <w:t xml:space="preserve">main</w:t>
+      </w:r>
+      <w:r>
+        <w:t xml:space="preserve">; that workflow can also be run by hand. Since October 20 and 21 the server backs up the database every day and before every update, checks each backup with a test restore and keeps the last 14; Caddy sends security headers and a content security policy; Docker checks the health of every container and caps the size of their logs. Since October 21 the API Gateway also cuts the tokens of closed sessions by asking security-service, with the answer kept 30 seconds per token, without changing the decision to use JWT.</w:t>
       </w:r>
     </w:p>
-    <w:bookmarkEnd w:id="18"/>
-    <w:bookmarkStart w:id="19" w:name="X40fc8b0ae8aa6259c2932519e0af4277a4161f3"/>
+    <w:bookmarkEnd w:id="15"/>
+    <w:bookmarkStart w:id="16" w:name="X40fc8b0ae8aa6259c2932519e0af4277a4161f3"/>
     <w:p>
       <w:pPr>
         <w:pStyle w:val="Heading3"/>
@@ -2227,9 +2212,9 @@
         </w:pict>
       </w:r>
     </w:p>
-    <w:bookmarkEnd w:id="19"/>
-    <w:bookmarkEnd w:id="20"/>
-    <w:bookmarkStart w:id="21" w:name="X82eb1247d730b77191b20da384467600c9190de"/>
+    <w:bookmarkEnd w:id="16"/>
+    <w:bookmarkEnd w:id="17"/>
+    <w:bookmarkStart w:id="18" w:name="X82eb1247d730b77191b20da384467600c9190de"/>
     <w:p>
       <w:pPr>
         <w:pStyle w:val="Heading2"/>
@@ -3520,8 +3505,8 @@
         </w:pict>
       </w:r>
     </w:p>
-    <w:bookmarkEnd w:id="21"/>
-    <w:bookmarkStart w:id="31" w:name="Xff0f04bdee79ccfef6d6a0b240cba1b13922e13"/>
+    <w:bookmarkEnd w:id="18"/>
+    <w:bookmarkStart w:id="28" w:name="Xff0f04bdee79ccfef6d6a0b240cba1b13922e13"/>
     <w:p>
       <w:pPr>
         <w:pStyle w:val="Heading2"/>
@@ -4500,7 +4485,7 @@
         <w:t xml:space="preserve">W = project week; week 1 is the week the contract is signed. Each week has 5 working days of 8 hours. █ = week with work in the phase; ◆ = milestone. The effort adds up the hours of everyone involved.</w:t>
       </w:r>
     </w:p>
-    <w:bookmarkStart w:id="22" w:name="phase-1-kickoff-and-requirements-w1w3"/>
+    <w:bookmarkStart w:id="19" w:name="phase-1-kickoff-and-requirements-w1w3"/>
     <w:p>
       <w:pPr>
         <w:pStyle w:val="Heading4"/>
@@ -5028,8 +5013,8 @@
         </w:tc>
       </w:tr>
     </w:tbl>
-    <w:bookmarkEnd w:id="22"/>
-    <w:bookmarkStart w:id="23" w:name="phase-2-analysis-and-design-w4w6"/>
+    <w:bookmarkEnd w:id="19"/>
+    <w:bookmarkStart w:id="20" w:name="phase-2-analysis-and-design-w4w6"/>
     <w:p>
       <w:pPr>
         <w:pStyle w:val="Heading4"/>
@@ -5715,8 +5700,8 @@
         </w:tc>
       </w:tr>
     </w:tbl>
-    <w:bookmarkEnd w:id="23"/>
-    <w:bookmarkStart w:id="24" w:name="phase-3-technical-foundation-w5w7"/>
+    <w:bookmarkEnd w:id="20"/>
+    <w:bookmarkStart w:id="21" w:name="phase-3-technical-foundation-w5w7"/>
     <w:p>
       <w:pPr>
         <w:pStyle w:val="Heading4"/>
@@ -6240,8 +6225,8 @@
         </w:tc>
       </w:tr>
     </w:tbl>
-    <w:bookmarkEnd w:id="24"/>
-    <w:bookmarkStart w:id="25" w:name="phase-4-backend-construction-w7w17"/>
+    <w:bookmarkEnd w:id="21"/>
+    <w:bookmarkStart w:id="22" w:name="phase-4-backend-construction-w7w17"/>
     <w:p>
       <w:pPr>
         <w:pStyle w:val="Heading4"/>
@@ -7322,8 +7307,8 @@
         </w:tc>
       </w:tr>
     </w:tbl>
-    <w:bookmarkEnd w:id="25"/>
-    <w:bookmarkStart w:id="26" w:name="phase-5-web-app-construction-w7w18"/>
+    <w:bookmarkEnd w:id="22"/>
+    <w:bookmarkStart w:id="23" w:name="phase-5-web-app-construction-w7w18"/>
     <w:p>
       <w:pPr>
         <w:pStyle w:val="Heading4"/>
@@ -7768,8 +7753,8 @@
         </w:tc>
       </w:tr>
     </w:tbl>
-    <w:bookmarkEnd w:id="26"/>
-    <w:bookmarkStart w:id="27" w:name="phase-6-mobile-app-construction-w10w18"/>
+    <w:bookmarkEnd w:id="23"/>
+    <w:bookmarkStart w:id="24" w:name="phase-6-mobile-app-construction-w10w18"/>
     <w:p>
       <w:pPr>
         <w:pStyle w:val="Heading4"/>
@@ -8293,8 +8278,8 @@
         </w:tc>
       </w:tr>
     </w:tbl>
-    <w:bookmarkEnd w:id="27"/>
-    <w:bookmarkStart w:id="28" w:name="phase-7-testing-w6w23"/>
+    <w:bookmarkEnd w:id="24"/>
+    <w:bookmarkStart w:id="25" w:name="phase-7-testing-w6w23"/>
     <w:p>
       <w:pPr>
         <w:pStyle w:val="Heading4"/>
@@ -9059,8 +9044,8 @@
         </w:tc>
       </w:tr>
     </w:tbl>
-    <w:bookmarkEnd w:id="28"/>
-    <w:bookmarkStart w:id="29" w:name="phase-8-deployment-and-go-live-w18w23"/>
+    <w:bookmarkEnd w:id="25"/>
+    <w:bookmarkStart w:id="26" w:name="phase-8-deployment-and-go-live-w18w23"/>
     <w:p>
       <w:pPr>
         <w:pStyle w:val="Heading4"/>
@@ -9825,8 +9810,8 @@
         </w:tc>
       </w:tr>
     </w:tbl>
-    <w:bookmarkEnd w:id="29"/>
-    <w:bookmarkStart w:id="30" w:name="phase-9-stabilization-and-closure-w24w28"/>
+    <w:bookmarkEnd w:id="26"/>
+    <w:bookmarkStart w:id="27" w:name="phase-9-stabilization-and-closure-w24w28"/>
     <w:p>
       <w:pPr>
         <w:pStyle w:val="Heading4"/>
@@ -10203,9 +10188,9 @@
         </w:pict>
       </w:r>
     </w:p>
-    <w:bookmarkEnd w:id="30"/>
-    <w:bookmarkEnd w:id="31"/>
-    <w:bookmarkStart w:id="32" w:name="X8d56e0807c0bc0d857e3256cda774cc4156c22e"/>
+    <w:bookmarkEnd w:id="27"/>
+    <w:bookmarkEnd w:id="28"/>
+    <w:bookmarkStart w:id="29" w:name="X8d56e0807c0bc0d857e3256cda774cc4156c22e"/>
     <w:p>
       <w:pPr>
         <w:pStyle w:val="Heading2"/>
@@ -10869,8 +10854,8 @@
         </w:pict>
       </w:r>
     </w:p>
-    <w:bookmarkEnd w:id="32"/>
-    <w:bookmarkStart w:id="38" w:name="X069d71f853c0895f33c2fb192289fea3f1b87e5"/>
+    <w:bookmarkEnd w:id="29"/>
+    <w:bookmarkStart w:id="35" w:name="X069d71f853c0895f33c2fb192289fea3f1b87e5"/>
     <w:p>
       <w:pPr>
         <w:pStyle w:val="Heading2"/>
@@ -11161,7 +11146,7 @@
         </w:tc>
       </w:tr>
     </w:tbl>
-    <w:bookmarkStart w:id="33" w:name="Xfb6522b4ada438d098da2753c24e46d67147172"/>
+    <w:bookmarkStart w:id="30" w:name="Xfb6522b4ada438d098da2753c24e46d67147172"/>
     <w:p>
       <w:pPr>
         <w:pStyle w:val="Heading3"/>
@@ -11825,8 +11810,8 @@
         </w:tc>
       </w:tr>
     </w:tbl>
-    <w:bookmarkEnd w:id="33"/>
-    <w:bookmarkStart w:id="34" w:name="X7d6e1e7e7203e8faedd3f299667bdeaa96720e8"/>
+    <w:bookmarkEnd w:id="30"/>
+    <w:bookmarkStart w:id="31" w:name="X7d6e1e7e7203e8faedd3f299667bdeaa96720e8"/>
     <w:p>
       <w:pPr>
         <w:pStyle w:val="Heading3"/>
@@ -12347,8 +12332,8 @@
         </w:tc>
       </w:tr>
     </w:tbl>
-    <w:bookmarkEnd w:id="34"/>
-    <w:bookmarkStart w:id="35" w:name="X75ec9c0645f1e5241f32d56658351ad6c9e84fd"/>
+    <w:bookmarkEnd w:id="31"/>
+    <w:bookmarkStart w:id="32" w:name="X75ec9c0645f1e5241f32d56658351ad6c9e84fd"/>
     <w:p>
       <w:pPr>
         <w:pStyle w:val="Heading3"/>
@@ -13209,8 +13194,8 @@
         </w:tc>
       </w:tr>
     </w:tbl>
-    <w:bookmarkEnd w:id="35"/>
-    <w:bookmarkStart w:id="36" w:name="X4f4e63a24caf35cb1db9bc331f5eb01b5e0819b"/>
+    <w:bookmarkEnd w:id="32"/>
+    <w:bookmarkStart w:id="33" w:name="X4f4e63a24caf35cb1db9bc331f5eb01b5e0819b"/>
     <w:p>
       <w:pPr>
         <w:pStyle w:val="Heading3"/>
@@ -13663,8 +13648,8 @@
         </w:tc>
       </w:tr>
     </w:tbl>
-    <w:bookmarkEnd w:id="36"/>
-    <w:bookmarkStart w:id="37" w:name="Xc54d8f940de273ba636c4b6beefbbd03dbf7b59"/>
+    <w:bookmarkEnd w:id="33"/>
+    <w:bookmarkStart w:id="34" w:name="Xc54d8f940de273ba636c4b6beefbbd03dbf7b59"/>
     <w:p>
       <w:pPr>
         <w:pStyle w:val="Heading3"/>
@@ -13924,9 +13909,9 @@
         </w:pict>
       </w:r>
     </w:p>
-    <w:bookmarkEnd w:id="37"/>
-    <w:bookmarkEnd w:id="38"/>
-    <w:bookmarkStart w:id="39" w:name="X18de76301d15c44fa67693ac4bb7c458a55cd74"/>
+    <w:bookmarkEnd w:id="34"/>
+    <w:bookmarkEnd w:id="35"/>
+    <w:bookmarkStart w:id="36" w:name="X18de76301d15c44fa67693ac4bb7c458a55cd74"/>
     <w:p>
       <w:pPr>
         <w:pStyle w:val="Heading2"/>
@@ -14657,8 +14642,8 @@
         </w:pict>
       </w:r>
     </w:p>
-    <w:bookmarkEnd w:id="39"/>
-    <w:bookmarkStart w:id="40" w:name="Xc930717707498e18031d61b5c2c30fa47ce902f"/>
+    <w:bookmarkEnd w:id="36"/>
+    <w:bookmarkStart w:id="37" w:name="Xc930717707498e18031d61b5c2c30fa47ce902f"/>
     <w:p>
       <w:pPr>
         <w:pStyle w:val="Heading2"/>
@@ -14824,8 +14809,8 @@
         </w:pict>
       </w:r>
     </w:p>
-    <w:bookmarkEnd w:id="40"/>
-    <w:bookmarkStart w:id="41" w:name="X966374c2a461b484688544bade474c44f846409"/>
+    <w:bookmarkEnd w:id="37"/>
+    <w:bookmarkStart w:id="38" w:name="X966374c2a461b484688544bade474c44f846409"/>
     <w:p>
       <w:pPr>
         <w:pStyle w:val="Heading2"/>
@@ -15385,8 +15370,8 @@
         </w:pict>
       </w:r>
     </w:p>
-    <w:bookmarkEnd w:id="41"/>
-    <w:bookmarkStart w:id="42" w:name="X2464789d46b9f814a58a3e4bc9bdc37755e36c8"/>
+    <w:bookmarkEnd w:id="38"/>
+    <w:bookmarkStart w:id="39" w:name="X2464789d46b9f814a58a3e4bc9bdc37755e36c8"/>
     <w:p>
       <w:pPr>
         <w:pStyle w:val="Heading2"/>
@@ -15966,8 +15951,8 @@
         </w:pict>
       </w:r>
     </w:p>
-    <w:bookmarkEnd w:id="42"/>
-    <w:bookmarkStart w:id="60" w:name="references"/>
+    <w:bookmarkEnd w:id="39"/>
+    <w:bookmarkStart w:id="57" w:name="references"/>
     <w:p>
       <w:pPr>
         <w:pStyle w:val="Heading2"/>
@@ -15999,7 +15984,7 @@
       <w:r>
         <w:t xml:space="preserve"> </w:t>
       </w:r>
-      <w:hyperlink r:id="rId43">
+      <w:hyperlink r:id="rId40">
         <w:r>
           <w:rPr>
             <w:rStyle w:val="Hyperlink"/>
@@ -16031,7 +16016,7 @@
       <w:r>
         <w:t xml:space="preserve"> </w:t>
       </w:r>
-      <w:hyperlink r:id="rId44">
+      <w:hyperlink r:id="rId41">
         <w:r>
           <w:rPr>
             <w:rStyle w:val="Hyperlink"/>
@@ -16066,7 +16051,7 @@
       <w:r>
         <w:t xml:space="preserve"> </w:t>
       </w:r>
-      <w:hyperlink r:id="rId45">
+      <w:hyperlink r:id="rId42">
         <w:r>
           <w:rPr>
             <w:rStyle w:val="Hyperlink"/>
@@ -16101,7 +16086,7 @@
       <w:r>
         <w:t xml:space="preserve"> </w:t>
       </w:r>
-      <w:hyperlink r:id="rId46">
+      <w:hyperlink r:id="rId43">
         <w:r>
           <w:rPr>
             <w:rStyle w:val="Hyperlink"/>
@@ -16133,7 +16118,7 @@
       <w:r>
         <w:t xml:space="preserve"> </w:t>
       </w:r>
-      <w:hyperlink r:id="rId47">
+      <w:hyperlink r:id="rId44">
         <w:r>
           <w:rPr>
             <w:rStyle w:val="Hyperlink"/>
@@ -16168,7 +16153,7 @@
       <w:r>
         <w:t xml:space="preserve"> </w:t>
       </w:r>
-      <w:hyperlink r:id="rId48">
+      <w:hyperlink r:id="rId45">
         <w:r>
           <w:rPr>
             <w:rStyle w:val="Hyperlink"/>
@@ -16203,7 +16188,7 @@
       <w:r>
         <w:t xml:space="preserve"> </w:t>
       </w:r>
-      <w:hyperlink r:id="rId49">
+      <w:hyperlink r:id="rId46">
         <w:r>
           <w:rPr>
             <w:rStyle w:val="Hyperlink"/>
@@ -16235,7 +16220,7 @@
       <w:r>
         <w:t xml:space="preserve"> </w:t>
       </w:r>
-      <w:hyperlink r:id="rId50">
+      <w:hyperlink r:id="rId47">
         <w:r>
           <w:rPr>
             <w:rStyle w:val="Hyperlink"/>
@@ -16270,7 +16255,7 @@
       <w:r>
         <w:t xml:space="preserve"> </w:t>
       </w:r>
-      <w:hyperlink r:id="rId51">
+      <w:hyperlink r:id="rId48">
         <w:r>
           <w:rPr>
             <w:rStyle w:val="Hyperlink"/>
@@ -16329,7 +16314,7 @@
       <w:r>
         <w:t xml:space="preserve"> </w:t>
       </w:r>
-      <w:hyperlink r:id="rId52">
+      <w:hyperlink r:id="rId49">
         <w:r>
           <w:rPr>
             <w:rStyle w:val="Hyperlink"/>
@@ -16364,7 +16349,7 @@
       <w:r>
         <w:t xml:space="preserve"> </w:t>
       </w:r>
-      <w:hyperlink r:id="rId53">
+      <w:hyperlink r:id="rId50">
         <w:r>
           <w:rPr>
             <w:rStyle w:val="Hyperlink"/>
@@ -16399,7 +16384,7 @@
       <w:r>
         <w:t xml:space="preserve"> </w:t>
       </w:r>
-      <w:hyperlink r:id="rId54">
+      <w:hyperlink r:id="rId51">
         <w:r>
           <w:rPr>
             <w:rStyle w:val="Hyperlink"/>
@@ -16431,7 +16416,7 @@
       <w:r>
         <w:t xml:space="preserve"> </w:t>
       </w:r>
-      <w:hyperlink r:id="rId55">
+      <w:hyperlink r:id="rId52">
         <w:r>
           <w:rPr>
             <w:rStyle w:val="Hyperlink"/>
@@ -16463,7 +16448,7 @@
       <w:r>
         <w:t xml:space="preserve"> </w:t>
       </w:r>
-      <w:hyperlink r:id="rId56">
+      <w:hyperlink r:id="rId53">
         <w:r>
           <w:rPr>
             <w:rStyle w:val="Hyperlink"/>
@@ -16498,7 +16483,7 @@
       <w:r>
         <w:t xml:space="preserve"> </w:t>
       </w:r>
-      <w:hyperlink r:id="rId57">
+      <w:hyperlink r:id="rId54">
         <w:r>
           <w:rPr>
             <w:rStyle w:val="Hyperlink"/>
@@ -16533,7 +16518,7 @@
       <w:r>
         <w:t xml:space="preserve"> </w:t>
       </w:r>
-      <w:hyperlink r:id="rId58">
+      <w:hyperlink r:id="rId55">
         <w:r>
           <w:rPr>
             <w:rStyle w:val="Hyperlink"/>
@@ -16565,7 +16550,7 @@
       <w:r>
         <w:t xml:space="preserve"> </w:t>
       </w:r>
-      <w:hyperlink r:id="rId59">
+      <w:hyperlink r:id="rId56">
         <w:r>
           <w:rPr>
             <w:rStyle w:val="Hyperlink"/>
@@ -16574,8 +16559,8 @@
         </w:r>
       </w:hyperlink>
     </w:p>
-    <w:bookmarkEnd w:id="60"/>
-    <w:bookmarkEnd w:id="61"/>
+    <w:bookmarkEnd w:id="57"/>
+    <w:bookmarkEnd w:id="58"/>
     <w:sectPr>
       <w:footnotePr>
         <w:numRestart w:val="eachSect"/>

</xml_diff>